<commit_message>
Auto-generate docs and exports
</commit_message>
<xml_diff>
--- a/exports/appendices.docx
+++ b/exports/appendices.docx
@@ -139,6 +139,30 @@
         </w:tc>
       </w:tr>
     </w:tbl>
+    <w:p>
+      <w:pPr>
+        <w:pStyle w:val="BodyText"/>
+      </w:pPr>
+      <w:r>
+        <w:t xml:space="preserve">A-01 | Global Naming Convention | Approved |</w:t>
+      </w:r>
+    </w:p>
+    <w:p>
+      <w:pPr>
+        <w:pStyle w:val="BodyText"/>
+      </w:pPr>
+      <w:r>
+        <w:t xml:space="preserve">A-02 | Global IP Addressing Standard | Approved |</w:t>
+      </w:r>
+    </w:p>
+    <w:p>
+      <w:pPr>
+        <w:pStyle w:val="BodyText"/>
+      </w:pPr>
+      <w:r>
+        <w:t xml:space="preserve">A-03 | Global VLAN Assignment Standard | Approved |</w:t>
+      </w:r>
+    </w:p>
     <w:bookmarkEnd w:id="21"/>
     <w:bookmarkStart w:id="22" w:name="network-patterns-aa-az"/>
     <w:p>

</xml_diff>